<commit_message>
Edit Soglasie, add *.asv at ignore
</commit_message>
<xml_diff>
--- a/НиВБ/Требования/!НиВБ_Заявка_на_публикацию_в_журнале.docx
+++ b/НиВБ/Требования/!НиВБ_Заявка_на_публикацию_в_журнале.docx
@@ -1,6 +1,6 @@
 
 <file path=word/document.xml><?xml version="1.0" encoding="utf-8"?>
-<w:document xmlns:wpc="http://schemas.microsoft.com/office/word/2010/wordprocessingCanvas" xmlns:cx="http://schemas.microsoft.com/office/drawing/2014/chartex" xmlns:cx1="http://schemas.microsoft.com/office/drawing/2015/9/8/chartex" xmlns:cx2="http://schemas.microsoft.com/office/drawing/2015/10/21/chartex" xmlns:cx3="http://schemas.microsoft.com/office/drawing/2016/5/9/chartex" xmlns:cx4="http://schemas.microsoft.com/office/drawing/2016/5/10/chartex" xmlns:cx5="http://schemas.microsoft.com/office/drawing/2016/5/11/chartex" xmlns:cx6="http://schemas.microsoft.com/office/drawing/2016/5/12/chartex" xmlns:cx7="http://schemas.microsoft.com/office/drawing/2016/5/13/chartex" xmlns:cx8="http://schemas.microsoft.com/office/drawing/2016/5/14/chartex" xmlns:mc="http://schemas.openxmlformats.org/markup-compatibility/2006" xmlns:aink="http://schemas.microsoft.com/office/drawing/2016/ink" xmlns:am3d="http://schemas.microsoft.com/office/drawing/2017/model3d" xmlns:o="urn:schemas-microsoft-com:office:office" xmlns:r="http://schemas.openxmlformats.org/officeDocument/2006/relationships" xmlns:m="http://schemas.openxmlformats.org/officeDocument/2006/math" xmlns:v="urn:schemas-microsoft-com:vml" xmlns:wp14="http://schemas.microsoft.com/office/word/2010/wordprocessingDrawing" xmlns:wp="http://schemas.openxmlformats.org/drawingml/2006/wordprocessingDrawing" xmlns:w10="urn:schemas-microsoft-com:office:word" xmlns:w="http://schemas.openxmlformats.org/wordprocessingml/2006/main" xmlns:w14="http://schemas.microsoft.com/office/word/2010/wordml" xmlns:w15="http://schemas.microsoft.com/office/word/2012/wordml" xmlns:w16cex="http://schemas.microsoft.com/office/word/2018/wordml/cex" xmlns:w16cid="http://schemas.microsoft.com/office/word/2016/wordml/cid" xmlns:w16="http://schemas.microsoft.com/office/word/2018/wordml" xmlns:w16sdtdh="http://schemas.microsoft.com/office/word/2020/wordml/sdtdatahash" xmlns:w16se="http://schemas.microsoft.com/office/word/2015/wordml/symex" xmlns:wpg="http://schemas.microsoft.com/office/word/2010/wordprocessingGroup" xmlns:wpi="http://schemas.microsoft.com/office/word/2010/wordprocessingInk" xmlns:wne="http://schemas.microsoft.com/office/word/2006/wordml" xmlns:wps="http://schemas.microsoft.com/office/word/2010/wordprocessingShape" mc:Ignorable="w14 w15 w16se w16cid w16 w16cex w16sdtdh wp14">
+<w:document xmlns:wpc="http://schemas.microsoft.com/office/word/2010/wordprocessingCanvas" xmlns:cx="http://schemas.microsoft.com/office/drawing/2014/chartex" xmlns:cx1="http://schemas.microsoft.com/office/drawing/2015/9/8/chartex" xmlns:mc="http://schemas.openxmlformats.org/markup-compatibility/2006" xmlns:o="urn:schemas-microsoft-com:office:office" xmlns:r="http://schemas.openxmlformats.org/officeDocument/2006/relationships" xmlns:m="http://schemas.openxmlformats.org/officeDocument/2006/math" xmlns:v="urn:schemas-microsoft-com:vml" xmlns:wp14="http://schemas.microsoft.com/office/word/2010/wordprocessingDrawing" xmlns:wp="http://schemas.openxmlformats.org/drawingml/2006/wordprocessingDrawing" xmlns:w10="urn:schemas-microsoft-com:office:word" xmlns:w="http://schemas.openxmlformats.org/wordprocessingml/2006/main" xmlns:w14="http://schemas.microsoft.com/office/word/2010/wordml" xmlns:w15="http://schemas.microsoft.com/office/word/2012/wordml" xmlns:w16se="http://schemas.microsoft.com/office/word/2015/wordml/symex" xmlns:wpg="http://schemas.microsoft.com/office/word/2010/wordprocessingGroup" xmlns:wpi="http://schemas.microsoft.com/office/word/2010/wordprocessingInk" xmlns:wne="http://schemas.microsoft.com/office/word/2006/wordml" xmlns:wps="http://schemas.microsoft.com/office/word/2010/wordprocessingShape" mc:Ignorable="w14 w15 w16se wp14">
   <w:body>
     <w:p>
       <w:pPr>
@@ -716,6 +716,7 @@
                 </w:rPr>
                 <w:t>.</w:t>
               </w:r>
+              <w:proofErr w:type="spellStart"/>
               <w:r>
                 <w:rPr>
                   <w:rStyle w:val="af"/>
@@ -728,6 +729,7 @@
                 </w:rPr>
                 <w:t>ru</w:t>
               </w:r>
+              <w:proofErr w:type="spellEnd"/>
             </w:hyperlink>
           </w:p>
         </w:tc>
@@ -992,13 +994,23 @@
               </w:rPr>
               <w:t>-</w:t>
             </w:r>
-            <w:r>
-              <w:rPr>
-                <w:rFonts w:ascii="Century Schoolbook" w:hAnsi="Century Schoolbook"/>
-                <w:sz w:val="18"/>
-                <w:szCs w:val="20"/>
-              </w:rPr>
-              <w:t>ая) по адресу:</w:t>
+            <w:proofErr w:type="spellStart"/>
+            <w:r>
+              <w:rPr>
+                <w:rFonts w:ascii="Century Schoolbook" w:hAnsi="Century Schoolbook"/>
+                <w:sz w:val="18"/>
+                <w:szCs w:val="20"/>
+              </w:rPr>
+              <w:t>ая</w:t>
+            </w:r>
+            <w:proofErr w:type="spellEnd"/>
+            <w:r>
+              <w:rPr>
+                <w:rFonts w:ascii="Century Schoolbook" w:hAnsi="Century Schoolbook"/>
+                <w:sz w:val="18"/>
+                <w:szCs w:val="20"/>
+              </w:rPr>
+              <w:t>) по адресу:</w:t>
             </w:r>
           </w:p>
         </w:tc>
@@ -1027,7 +1039,23 @@
                 <w:sz w:val="18"/>
                 <w:szCs w:val="20"/>
               </w:rPr>
-              <w:t>г. Москва, ул. Пруд-Ключики, 5 кв 22</w:t>
+              <w:t>г. Москва, ул. Пруд-Ключики, 5 кв</w:t>
+            </w:r>
+            <w:r>
+              <w:rPr>
+                <w:rFonts w:ascii="Century Schoolbook" w:hAnsi="Century Schoolbook"/>
+                <w:sz w:val="18"/>
+                <w:szCs w:val="20"/>
+              </w:rPr>
+              <w:t>.</w:t>
+            </w:r>
+            <w:r>
+              <w:rPr>
+                <w:rFonts w:ascii="Century Schoolbook" w:hAnsi="Century Schoolbook"/>
+                <w:sz w:val="18"/>
+                <w:szCs w:val="20"/>
+              </w:rPr>
+              <w:t xml:space="preserve"> 22</w:t>
             </w:r>
           </w:p>
         </w:tc>
@@ -1631,7 +1659,27 @@
           <w:szCs w:val="20"/>
           <w:u w:val="single"/>
         </w:rPr>
-        <w:t xml:space="preserve">образования «Военная академия материально-технического обеспечения имени генерала армии А.В. Хрулева» </w:t>
+        <w:t xml:space="preserve">образования «Военная академия материально-технического обеспечения имени генерала армии А.В. </w:t>
+      </w:r>
+      <w:proofErr w:type="spellStart"/>
+      <w:r>
+        <w:rPr>
+          <w:rFonts w:ascii="Century Schoolbook" w:hAnsi="Century Schoolbook"/>
+          <w:sz w:val="18"/>
+          <w:szCs w:val="20"/>
+          <w:u w:val="single"/>
+        </w:rPr>
+        <w:t>Хрулева</w:t>
+      </w:r>
+      <w:proofErr w:type="spellEnd"/>
+      <w:r>
+        <w:rPr>
+          <w:rFonts w:ascii="Century Schoolbook" w:hAnsi="Century Schoolbook"/>
+          <w:sz w:val="18"/>
+          <w:szCs w:val="20"/>
+          <w:u w:val="single"/>
+        </w:rPr>
+        <w:t xml:space="preserve">» </w:t>
       </w:r>
       <w:r>
         <w:rPr>
@@ -2067,15 +2115,61 @@
                 <w:szCs w:val="20"/>
               </w:rPr>
             </w:pPr>
+            <w:proofErr w:type="spellStart"/>
             <w:r>
               <w:rPr>
                 <w:rFonts w:ascii="Century Schoolbook" w:hAnsi="Century Schoolbook" w:cs="TimesNewRomanPS-ItalicMT"/>
                 <w:i/>
                 <w:iCs/>
-                <w:sz w:val="12"/>
-                <w:szCs w:val="20"/>
-              </w:rPr>
-              <w:t xml:space="preserve">Полносвязная нейросеть в качестве модели подвижности военной </w:t>
+                <w:sz w:val="18"/>
+                <w:szCs w:val="20"/>
+              </w:rPr>
+              <w:t>Полно</w:t>
+            </w:r>
+            <w:bookmarkStart w:id="0" w:name="_GoBack"/>
+            <w:bookmarkEnd w:id="0"/>
+            <w:r>
+              <w:rPr>
+                <w:rFonts w:ascii="Century Schoolbook" w:hAnsi="Century Schoolbook" w:cs="TimesNewRomanPS-ItalicMT"/>
+                <w:i/>
+                <w:iCs/>
+                <w:sz w:val="18"/>
+                <w:szCs w:val="20"/>
+              </w:rPr>
+              <w:t>связная</w:t>
+            </w:r>
+            <w:proofErr w:type="spellEnd"/>
+            <w:r>
+              <w:rPr>
+                <w:rFonts w:ascii="Century Schoolbook" w:hAnsi="Century Schoolbook" w:cs="TimesNewRomanPS-ItalicMT"/>
+                <w:i/>
+                <w:iCs/>
+                <w:sz w:val="18"/>
+                <w:szCs w:val="20"/>
+              </w:rPr>
+              <w:t xml:space="preserve"> </w:t>
+            </w:r>
+            <w:proofErr w:type="spellStart"/>
+            <w:r>
+              <w:rPr>
+                <w:rFonts w:ascii="Century Schoolbook" w:hAnsi="Century Schoolbook" w:cs="TimesNewRomanPS-ItalicMT"/>
+                <w:i/>
+                <w:iCs/>
+                <w:sz w:val="18"/>
+                <w:szCs w:val="20"/>
+              </w:rPr>
+              <w:t>нейросеть</w:t>
+            </w:r>
+            <w:proofErr w:type="spellEnd"/>
+            <w:r>
+              <w:rPr>
+                <w:rFonts w:ascii="Century Schoolbook" w:hAnsi="Century Schoolbook" w:cs="TimesNewRomanPS-ItalicMT"/>
+                <w:i/>
+                <w:iCs/>
+                <w:sz w:val="18"/>
+                <w:szCs w:val="20"/>
+              </w:rPr>
+              <w:t xml:space="preserve"> в средствах автоматизации </w:t>
             </w:r>
           </w:p>
         </w:tc>
@@ -2125,9 +2219,8 @@
               <w:adjustRightInd w:val="0"/>
               <w:rPr>
                 <w:rFonts w:ascii="Century Schoolbook" w:hAnsi="Century Schoolbook" w:cs="TimesNewRomanPS-ItalicMT"/>
-                <w:i/>
                 <w:iCs/>
-                <w:sz w:val="12"/>
+                <w:sz w:val="18"/>
                 <w:szCs w:val="20"/>
               </w:rPr>
             </w:pPr>
@@ -2136,10 +2229,38 @@
                 <w:rFonts w:ascii="Century Schoolbook" w:hAnsi="Century Schoolbook" w:cs="TimesNewRomanPS-ItalicMT"/>
                 <w:i/>
                 <w:iCs/>
-                <w:sz w:val="12"/>
-                <w:szCs w:val="20"/>
-              </w:rPr>
-              <w:t>автомобильной техники</w:t>
+                <w:sz w:val="18"/>
+                <w:szCs w:val="20"/>
+              </w:rPr>
+              <w:t>систем</w:t>
+            </w:r>
+            <w:r>
+              <w:rPr>
+                <w:rFonts w:ascii="Century Schoolbook" w:hAnsi="Century Schoolbook" w:cs="TimesNewRomanPS-ItalicMT"/>
+                <w:iCs/>
+                <w:sz w:val="18"/>
+                <w:szCs w:val="20"/>
+              </w:rPr>
+              <w:t xml:space="preserve"> </w:t>
+            </w:r>
+            <w:r>
+              <w:rPr>
+                <w:rFonts w:ascii="Century Schoolbook" w:hAnsi="Century Schoolbook" w:cs="TimesNewRomanPS-ItalicMT"/>
+                <w:i/>
+                <w:iCs/>
+                <w:sz w:val="18"/>
+                <w:szCs w:val="20"/>
+              </w:rPr>
+              <w:t>дистанционного управления военного автомобиля</w:t>
+            </w:r>
+            <w:r>
+              <w:rPr>
+                <w:rFonts w:ascii="Century Schoolbook" w:hAnsi="Century Schoolbook" w:cs="TimesNewRomanPS-ItalicMT"/>
+                <w:iCs/>
+                <w:sz w:val="18"/>
+                <w:szCs w:val="20"/>
+              </w:rPr>
+              <w:t xml:space="preserve"> </w:t>
             </w:r>
           </w:p>
         </w:tc>
@@ -2387,7 +2508,25 @@
           <w:sz w:val="12"/>
           <w:szCs w:val="20"/>
         </w:rPr>
-        <w:t>подготовка и размещение метаданных произведения, включенного в составпериодического издания, в том числе: фамилия, имя, отчество, место работы, адрес электронной</w:t>
+        <w:t xml:space="preserve">подготовка и размещение метаданных произведения, включенного в </w:t>
+      </w:r>
+      <w:proofErr w:type="spellStart"/>
+      <w:r>
+        <w:rPr>
+          <w:rFonts w:ascii="Century Schoolbook" w:hAnsi="Century Schoolbook"/>
+          <w:sz w:val="12"/>
+          <w:szCs w:val="20"/>
+        </w:rPr>
+        <w:t>составпериодического</w:t>
+      </w:r>
+      <w:proofErr w:type="spellEnd"/>
+      <w:r>
+        <w:rPr>
+          <w:rFonts w:ascii="Century Schoolbook" w:hAnsi="Century Schoolbook"/>
+          <w:sz w:val="12"/>
+          <w:szCs w:val="20"/>
+        </w:rPr>
+        <w:t xml:space="preserve"> издания, в том числе: фамилия, имя, отчество, место работы, адрес электронной</w:t>
       </w:r>
       <w:r>
         <w:rPr>
@@ -2667,6 +2806,7 @@
         </w:rPr>
         <w:t xml:space="preserve">В целях, предусмотренных </w:t>
       </w:r>
+      <w:proofErr w:type="spellStart"/>
       <w:r>
         <w:rPr>
           <w:rFonts w:ascii="Century Schoolbook" w:hAnsi="Century Schoolbook"/>
@@ -2681,7 +2821,16 @@
           <w:sz w:val="12"/>
           <w:szCs w:val="20"/>
         </w:rPr>
-        <w:t>п. 1</w:t>
+        <w:t>п</w:t>
+      </w:r>
+      <w:proofErr w:type="spellEnd"/>
+      <w:r>
+        <w:rPr>
+          <w:rFonts w:ascii="Century Schoolbook" w:hAnsi="Century Schoolbook"/>
+          <w:sz w:val="12"/>
+          <w:szCs w:val="20"/>
+        </w:rPr>
+        <w:t>. 1</w:t>
       </w:r>
       <w:r>
         <w:rPr>
@@ -4299,7 +4448,7 @@
 </file>
 
 <file path=word/endnotes.xml><?xml version="1.0" encoding="utf-8"?>
-<w:endnotes xmlns:wpc="http://schemas.microsoft.com/office/word/2010/wordprocessingCanvas" xmlns:cx="http://schemas.microsoft.com/office/drawing/2014/chartex" xmlns:cx1="http://schemas.microsoft.com/office/drawing/2015/9/8/chartex" xmlns:cx2="http://schemas.microsoft.com/office/drawing/2015/10/21/chartex" xmlns:cx3="http://schemas.microsoft.com/office/drawing/2016/5/9/chartex" xmlns:cx4="http://schemas.microsoft.com/office/drawing/2016/5/10/chartex" xmlns:cx5="http://schemas.microsoft.com/office/drawing/2016/5/11/chartex" xmlns:cx6="http://schemas.microsoft.com/office/drawing/2016/5/12/chartex" xmlns:cx7="http://schemas.microsoft.com/office/drawing/2016/5/13/chartex" xmlns:cx8="http://schemas.microsoft.com/office/drawing/2016/5/14/chartex" xmlns:mc="http://schemas.openxmlformats.org/markup-compatibility/2006" xmlns:aink="http://schemas.microsoft.com/office/drawing/2016/ink" xmlns:am3d="http://schemas.microsoft.com/office/drawing/2017/model3d" xmlns:o="urn:schemas-microsoft-com:office:office" xmlns:r="http://schemas.openxmlformats.org/officeDocument/2006/relationships" xmlns:m="http://schemas.openxmlformats.org/officeDocument/2006/math" xmlns:v="urn:schemas-microsoft-com:vml" xmlns:wp14="http://schemas.microsoft.com/office/word/2010/wordprocessingDrawing" xmlns:wp="http://schemas.openxmlformats.org/drawingml/2006/wordprocessingDrawing" xmlns:w10="urn:schemas-microsoft-com:office:word" xmlns:w="http://schemas.openxmlformats.org/wordprocessingml/2006/main" xmlns:w14="http://schemas.microsoft.com/office/word/2010/wordml" xmlns:w15="http://schemas.microsoft.com/office/word/2012/wordml" xmlns:w16cex="http://schemas.microsoft.com/office/word/2018/wordml/cex" xmlns:w16cid="http://schemas.microsoft.com/office/word/2016/wordml/cid" xmlns:w16="http://schemas.microsoft.com/office/word/2018/wordml" xmlns:w16sdtdh="http://schemas.microsoft.com/office/word/2020/wordml/sdtdatahash" xmlns:w16se="http://schemas.microsoft.com/office/word/2015/wordml/symex" xmlns:wpg="http://schemas.microsoft.com/office/word/2010/wordprocessingGroup" xmlns:wpi="http://schemas.microsoft.com/office/word/2010/wordprocessingInk" xmlns:wne="http://schemas.microsoft.com/office/word/2006/wordml" xmlns:wps="http://schemas.microsoft.com/office/word/2010/wordprocessingShape" mc:Ignorable="w14 w15 w16se w16cid w16 w16cex w16sdtdh wp14">
+<w:endnotes xmlns:wpc="http://schemas.microsoft.com/office/word/2010/wordprocessingCanvas" xmlns:cx="http://schemas.microsoft.com/office/drawing/2014/chartex" xmlns:cx1="http://schemas.microsoft.com/office/drawing/2015/9/8/chartex" xmlns:mc="http://schemas.openxmlformats.org/markup-compatibility/2006" xmlns:o="urn:schemas-microsoft-com:office:office" xmlns:r="http://schemas.openxmlformats.org/officeDocument/2006/relationships" xmlns:m="http://schemas.openxmlformats.org/officeDocument/2006/math" xmlns:v="urn:schemas-microsoft-com:vml" xmlns:wp14="http://schemas.microsoft.com/office/word/2010/wordprocessingDrawing" xmlns:wp="http://schemas.openxmlformats.org/drawingml/2006/wordprocessingDrawing" xmlns:w10="urn:schemas-microsoft-com:office:word" xmlns:w="http://schemas.openxmlformats.org/wordprocessingml/2006/main" xmlns:w14="http://schemas.microsoft.com/office/word/2010/wordml" xmlns:w15="http://schemas.microsoft.com/office/word/2012/wordml" xmlns:w16se="http://schemas.microsoft.com/office/word/2015/wordml/symex" xmlns:wpg="http://schemas.microsoft.com/office/word/2010/wordprocessingGroup" xmlns:wpi="http://schemas.microsoft.com/office/word/2010/wordprocessingInk" xmlns:wne="http://schemas.microsoft.com/office/word/2006/wordml" xmlns:wps="http://schemas.microsoft.com/office/word/2010/wordprocessingShape" mc:Ignorable="w14 w15 w16se wp14">
   <w:endnote w:type="separator" w:id="-1">
     <w:p>
       <w:pPr>
@@ -4324,7 +4473,7 @@
 </file>
 
 <file path=word/footnotes.xml><?xml version="1.0" encoding="utf-8"?>
-<w:footnotes xmlns:wpc="http://schemas.microsoft.com/office/word/2010/wordprocessingCanvas" xmlns:cx="http://schemas.microsoft.com/office/drawing/2014/chartex" xmlns:cx1="http://schemas.microsoft.com/office/drawing/2015/9/8/chartex" xmlns:cx2="http://schemas.microsoft.com/office/drawing/2015/10/21/chartex" xmlns:cx3="http://schemas.microsoft.com/office/drawing/2016/5/9/chartex" xmlns:cx4="http://schemas.microsoft.com/office/drawing/2016/5/10/chartex" xmlns:cx5="http://schemas.microsoft.com/office/drawing/2016/5/11/chartex" xmlns:cx6="http://schemas.microsoft.com/office/drawing/2016/5/12/chartex" xmlns:cx7="http://schemas.microsoft.com/office/drawing/2016/5/13/chartex" xmlns:cx8="http://schemas.microsoft.com/office/drawing/2016/5/14/chartex" xmlns:mc="http://schemas.openxmlformats.org/markup-compatibility/2006" xmlns:aink="http://schemas.microsoft.com/office/drawing/2016/ink" xmlns:am3d="http://schemas.microsoft.com/office/drawing/2017/model3d" xmlns:o="urn:schemas-microsoft-com:office:office" xmlns:r="http://schemas.openxmlformats.org/officeDocument/2006/relationships" xmlns:m="http://schemas.openxmlformats.org/officeDocument/2006/math" xmlns:v="urn:schemas-microsoft-com:vml" xmlns:wp14="http://schemas.microsoft.com/office/word/2010/wordprocessingDrawing" xmlns:wp="http://schemas.openxmlformats.org/drawingml/2006/wordprocessingDrawing" xmlns:w10="urn:schemas-microsoft-com:office:word" xmlns:w="http://schemas.openxmlformats.org/wordprocessingml/2006/main" xmlns:w14="http://schemas.microsoft.com/office/word/2010/wordml" xmlns:w15="http://schemas.microsoft.com/office/word/2012/wordml" xmlns:w16cex="http://schemas.microsoft.com/office/word/2018/wordml/cex" xmlns:w16cid="http://schemas.microsoft.com/office/word/2016/wordml/cid" xmlns:w16="http://schemas.microsoft.com/office/word/2018/wordml" xmlns:w16sdtdh="http://schemas.microsoft.com/office/word/2020/wordml/sdtdatahash" xmlns:w16se="http://schemas.microsoft.com/office/word/2015/wordml/symex" xmlns:wpg="http://schemas.microsoft.com/office/word/2010/wordprocessingGroup" xmlns:wpi="http://schemas.microsoft.com/office/word/2010/wordprocessingInk" xmlns:wne="http://schemas.microsoft.com/office/word/2006/wordml" xmlns:wps="http://schemas.microsoft.com/office/word/2010/wordprocessingShape" mc:Ignorable="w14 w15 w16se w16cid w16 w16cex w16sdtdh wp14">
+<w:footnotes xmlns:wpc="http://schemas.microsoft.com/office/word/2010/wordprocessingCanvas" xmlns:cx="http://schemas.microsoft.com/office/drawing/2014/chartex" xmlns:cx1="http://schemas.microsoft.com/office/drawing/2015/9/8/chartex" xmlns:mc="http://schemas.openxmlformats.org/markup-compatibility/2006" xmlns:o="urn:schemas-microsoft-com:office:office" xmlns:r="http://schemas.openxmlformats.org/officeDocument/2006/relationships" xmlns:m="http://schemas.openxmlformats.org/officeDocument/2006/math" xmlns:v="urn:schemas-microsoft-com:vml" xmlns:wp14="http://schemas.microsoft.com/office/word/2010/wordprocessingDrawing" xmlns:wp="http://schemas.openxmlformats.org/drawingml/2006/wordprocessingDrawing" xmlns:w10="urn:schemas-microsoft-com:office:word" xmlns:w="http://schemas.openxmlformats.org/wordprocessingml/2006/main" xmlns:w14="http://schemas.microsoft.com/office/word/2010/wordml" xmlns:w15="http://schemas.microsoft.com/office/word/2012/wordml" xmlns:w16se="http://schemas.microsoft.com/office/word/2015/wordml/symex" xmlns:wpg="http://schemas.microsoft.com/office/word/2010/wordprocessingGroup" xmlns:wpi="http://schemas.microsoft.com/office/word/2010/wordprocessingInk" xmlns:wne="http://schemas.microsoft.com/office/word/2006/wordml" xmlns:wps="http://schemas.microsoft.com/office/word/2010/wordprocessingShape" mc:Ignorable="w14 w15 w16se wp14">
   <w:footnote w:type="separator" w:id="-1">
     <w:p>
       <w:pPr>
@@ -4365,7 +4514,7 @@
 </file>
 
 <file path=word/numbering.xml><?xml version="1.0" encoding="utf-8"?>
-<w:numbering xmlns:wpc="http://schemas.microsoft.com/office/word/2010/wordprocessingCanvas" xmlns:cx="http://schemas.microsoft.com/office/drawing/2014/chartex" xmlns:cx1="http://schemas.microsoft.com/office/drawing/2015/9/8/chartex" xmlns:cx2="http://schemas.microsoft.com/office/drawing/2015/10/21/chartex" xmlns:cx3="http://schemas.microsoft.com/office/drawing/2016/5/9/chartex" xmlns:cx4="http://schemas.microsoft.com/office/drawing/2016/5/10/chartex" xmlns:cx5="http://schemas.microsoft.com/office/drawing/2016/5/11/chartex" xmlns:cx6="http://schemas.microsoft.com/office/drawing/2016/5/12/chartex" xmlns:cx7="http://schemas.microsoft.com/office/drawing/2016/5/13/chartex" xmlns:cx8="http://schemas.microsoft.com/office/drawing/2016/5/14/chartex" xmlns:mc="http://schemas.openxmlformats.org/markup-compatibility/2006" xmlns:aink="http://schemas.microsoft.com/office/drawing/2016/ink" xmlns:am3d="http://schemas.microsoft.com/office/drawing/2017/model3d" xmlns:o="urn:schemas-microsoft-com:office:office" xmlns:r="http://schemas.openxmlformats.org/officeDocument/2006/relationships" xmlns:m="http://schemas.openxmlformats.org/officeDocument/2006/math" xmlns:v="urn:schemas-microsoft-com:vml" xmlns:wp14="http://schemas.microsoft.com/office/word/2010/wordprocessingDrawing" xmlns:wp="http://schemas.openxmlformats.org/drawingml/2006/wordprocessingDrawing" xmlns:w10="urn:schemas-microsoft-com:office:word" xmlns:w="http://schemas.openxmlformats.org/wordprocessingml/2006/main" xmlns:w14="http://schemas.microsoft.com/office/word/2010/wordml" xmlns:w15="http://schemas.microsoft.com/office/word/2012/wordml" xmlns:w16cex="http://schemas.microsoft.com/office/word/2018/wordml/cex" xmlns:w16cid="http://schemas.microsoft.com/office/word/2016/wordml/cid" xmlns:w16="http://schemas.microsoft.com/office/word/2018/wordml" xmlns:w16sdtdh="http://schemas.microsoft.com/office/word/2020/wordml/sdtdatahash" xmlns:w16se="http://schemas.microsoft.com/office/word/2015/wordml/symex" xmlns:wpg="http://schemas.microsoft.com/office/word/2010/wordprocessingGroup" xmlns:wpi="http://schemas.microsoft.com/office/word/2010/wordprocessingInk" xmlns:wne="http://schemas.microsoft.com/office/word/2006/wordml" xmlns:wps="http://schemas.microsoft.com/office/word/2010/wordprocessingShape" mc:Ignorable="w14 w15 w16se w16cid w16 w16cex w16sdtdh wp14">
+<w:numbering xmlns:wpc="http://schemas.microsoft.com/office/word/2010/wordprocessingCanvas" xmlns:cx="http://schemas.microsoft.com/office/drawing/2014/chartex" xmlns:cx1="http://schemas.microsoft.com/office/drawing/2015/9/8/chartex" xmlns:mc="http://schemas.openxmlformats.org/markup-compatibility/2006" xmlns:o="urn:schemas-microsoft-com:office:office" xmlns:r="http://schemas.openxmlformats.org/officeDocument/2006/relationships" xmlns:m="http://schemas.openxmlformats.org/officeDocument/2006/math" xmlns:v="urn:schemas-microsoft-com:vml" xmlns:wp14="http://schemas.microsoft.com/office/word/2010/wordprocessingDrawing" xmlns:wp="http://schemas.openxmlformats.org/drawingml/2006/wordprocessingDrawing" xmlns:w10="urn:schemas-microsoft-com:office:word" xmlns:w="http://schemas.openxmlformats.org/wordprocessingml/2006/main" xmlns:w14="http://schemas.microsoft.com/office/word/2010/wordml" xmlns:w15="http://schemas.microsoft.com/office/word/2012/wordml" xmlns:w16se="http://schemas.microsoft.com/office/word/2015/wordml/symex" xmlns:wpg="http://schemas.microsoft.com/office/word/2010/wordprocessingGroup" xmlns:wpi="http://schemas.microsoft.com/office/word/2010/wordprocessingInk" xmlns:wne="http://schemas.microsoft.com/office/word/2006/wordml" xmlns:wps="http://schemas.microsoft.com/office/word/2010/wordprocessingShape" mc:Ignorable="w14 w15 w16se wp14">
   <w:abstractNum w:abstractNumId="0" w15:restartNumberingAfterBreak="0">
     <w:nsid w:val="1CB635F4"/>
     <w:multiLevelType w:val="hybridMultilevel"/>
@@ -4946,7 +5095,7 @@
 </file>
 
 <file path=word/styles.xml><?xml version="1.0" encoding="utf-8"?>
-<w:styles xmlns:mc="http://schemas.openxmlformats.org/markup-compatibility/2006" xmlns:r="http://schemas.openxmlformats.org/officeDocument/2006/relationships" xmlns:w="http://schemas.openxmlformats.org/wordprocessingml/2006/main" xmlns:w14="http://schemas.microsoft.com/office/word/2010/wordml" xmlns:w15="http://schemas.microsoft.com/office/word/2012/wordml" xmlns:w16cex="http://schemas.microsoft.com/office/word/2018/wordml/cex" xmlns:w16cid="http://schemas.microsoft.com/office/word/2016/wordml/cid" xmlns:w16="http://schemas.microsoft.com/office/word/2018/wordml" xmlns:w16sdtdh="http://schemas.microsoft.com/office/word/2020/wordml/sdtdatahash" xmlns:w16se="http://schemas.microsoft.com/office/word/2015/wordml/symex" mc:Ignorable="w14 w15 w16se w16cid w16 w16cex w16sdtdh">
+<w:styles xmlns:mc="http://schemas.openxmlformats.org/markup-compatibility/2006" xmlns:r="http://schemas.openxmlformats.org/officeDocument/2006/relationships" xmlns:w="http://schemas.openxmlformats.org/wordprocessingml/2006/main" xmlns:w14="http://schemas.microsoft.com/office/word/2010/wordml" xmlns:w15="http://schemas.microsoft.com/office/word/2012/wordml" xmlns:w16se="http://schemas.microsoft.com/office/word/2015/wordml/symex" mc:Ignorable="w14 w15 w16se">
   <w:docDefaults>
     <w:rPrDefault>
       <w:rPr>
@@ -4962,7 +5111,7 @@
       </w:pPr>
     </w:pPrDefault>
   </w:docDefaults>
-  <w:latentStyles w:defLockedState="0" w:defUIPriority="99" w:defSemiHidden="0" w:defUnhideWhenUsed="0" w:defQFormat="0" w:count="376">
+  <w:latentStyles w:defLockedState="0" w:defUIPriority="99" w:defSemiHidden="0" w:defUnhideWhenUsed="0" w:defQFormat="0" w:count="371">
     <w:lsdException w:name="Normal" w:uiPriority="0" w:qFormat="1"/>
     <w:lsdException w:name="heading 1" w:uiPriority="9" w:qFormat="1"/>
     <w:lsdException w:name="heading 2" w:semiHidden="1" w:uiPriority="9" w:unhideWhenUsed="1" w:qFormat="1"/>
@@ -5068,6 +5217,7 @@
     <w:lsdException w:name="HTML Sample" w:semiHidden="1" w:unhideWhenUsed="1"/>
     <w:lsdException w:name="HTML Typewriter" w:semiHidden="1" w:unhideWhenUsed="1"/>
     <w:lsdException w:name="HTML Variable" w:semiHidden="1" w:unhideWhenUsed="1"/>
+    <w:lsdException w:name="Normal Table" w:semiHidden="1" w:unhideWhenUsed="1"/>
     <w:lsdException w:name="annotation subject" w:semiHidden="1" w:unhideWhenUsed="1"/>
     <w:lsdException w:name="No List" w:semiHidden="1" w:unhideWhenUsed="1"/>
     <w:lsdException w:name="Outline List 1" w:semiHidden="1" w:unhideWhenUsed="1"/>
@@ -5110,8 +5260,11 @@
     <w:lsdException w:name="Table Contemporary" w:semiHidden="1" w:unhideWhenUsed="1"/>
     <w:lsdException w:name="Table Elegant" w:semiHidden="1" w:unhideWhenUsed="1"/>
     <w:lsdException w:name="Table Professional" w:semiHidden="1" w:unhideWhenUsed="1"/>
+    <w:lsdException w:name="Table Subtle 1" w:semiHidden="1" w:unhideWhenUsed="1"/>
     <w:lsdException w:name="Table Subtle 2" w:semiHidden="1" w:unhideWhenUsed="1"/>
     <w:lsdException w:name="Table Web 1" w:semiHidden="1" w:unhideWhenUsed="1"/>
+    <w:lsdException w:name="Table Web 2" w:semiHidden="1" w:unhideWhenUsed="1"/>
+    <w:lsdException w:name="Table Web 3" w:semiHidden="1" w:unhideWhenUsed="1"/>
     <w:lsdException w:name="Balloon Text" w:semiHidden="1" w:unhideWhenUsed="1"/>
     <w:lsdException w:name="Table Grid" w:uiPriority="39"/>
     <w:lsdException w:name="Table Theme" w:semiHidden="1" w:unhideWhenUsed="1"/>
@@ -5330,11 +5483,6 @@
     <w:lsdException w:name="List Table 5 Dark Accent 6" w:uiPriority="50"/>
     <w:lsdException w:name="List Table 6 Colorful Accent 6" w:uiPriority="51"/>
     <w:lsdException w:name="List Table 7 Colorful Accent 6" w:uiPriority="52"/>
-    <w:lsdException w:name="Mention" w:semiHidden="1" w:unhideWhenUsed="1"/>
-    <w:lsdException w:name="Smart Hyperlink" w:semiHidden="1" w:unhideWhenUsed="1"/>
-    <w:lsdException w:name="Hashtag" w:semiHidden="1" w:unhideWhenUsed="1"/>
-    <w:lsdException w:name="Unresolved Mention" w:semiHidden="1" w:unhideWhenUsed="1"/>
-    <w:lsdException w:name="Smart Link" w:semiHidden="1" w:unhideWhenUsed="1"/>
   </w:latentStyles>
   <w:style w:type="paragraph" w:default="1" w:styleId="a">
     <w:name w:val="Normal"/>
@@ -5543,6 +5691,37 @@
     <w:rPr>
       <w:color w:val="0563C1" w:themeColor="hyperlink"/>
       <w:u w:val="single"/>
+    </w:rPr>
+  </w:style>
+  <w:style w:type="paragraph" w:styleId="af0">
+    <w:name w:val="Body Text Indent"/>
+    <w:basedOn w:val="a"/>
+    <w:link w:val="af1"/>
+    <w:uiPriority w:val="99"/>
+    <w:rsid w:val="00AA2B28"/>
+    <w:pPr>
+      <w:spacing w:after="0" w:line="240" w:lineRule="auto"/>
+      <w:ind w:firstLine="540"/>
+      <w:jc w:val="both"/>
+    </w:pPr>
+    <w:rPr>
+      <w:rFonts w:ascii="Times New Roman" w:eastAsia="Times New Roman" w:hAnsi="Times New Roman" w:cs="Times New Roman"/>
+      <w:sz w:val="24"/>
+      <w:szCs w:val="24"/>
+      <w:lang w:eastAsia="ru-RU"/>
+    </w:rPr>
+  </w:style>
+  <w:style w:type="character" w:customStyle="1" w:styleId="af1">
+    <w:name w:val="Основной текст с отступом Знак"/>
+    <w:basedOn w:val="a0"/>
+    <w:link w:val="af0"/>
+    <w:uiPriority w:val="99"/>
+    <w:rsid w:val="00AA2B28"/>
+    <w:rPr>
+      <w:rFonts w:ascii="Times New Roman" w:eastAsia="Times New Roman" w:hAnsi="Times New Roman" w:cs="Times New Roman"/>
+      <w:sz w:val="24"/>
+      <w:szCs w:val="24"/>
+      <w:lang w:eastAsia="ru-RU"/>
     </w:rPr>
   </w:style>
 </w:styles>
@@ -5814,7 +5993,7 @@
 </file>
 
 <file path=customXml/itemProps1.xml><?xml version="1.0" encoding="utf-8"?>
-<ds:datastoreItem xmlns:ds="http://schemas.openxmlformats.org/officeDocument/2006/customXml" ds:itemID="{005D96EF-AC9E-4E54-B5EF-F91720A3F9DA}">
+<ds:datastoreItem xmlns:ds="http://schemas.openxmlformats.org/officeDocument/2006/customXml" ds:itemID="{E1A6DA7A-CE4E-4839-8308-EE8133DA789C}">
   <ds:schemaRefs>
     <ds:schemaRef ds:uri="http://schemas.openxmlformats.org/officeDocument/2006/bibliography"/>
   </ds:schemaRefs>

</xml_diff>